<commit_message>
Add first page to git
</commit_message>
<xml_diff>
--- a/HowToGit.docx
+++ b/HowToGit.docx
@@ -2,6 +2,890 @@
 <file path=word/document.xml><?xml version="1.0" encoding="utf-8"?>
 <w:document xmlns:wpc="http://schemas.microsoft.com/office/word/2010/wordprocessingCanvas" xmlns:cx="http://schemas.microsoft.com/office/drawing/2014/chartex" xmlns:cx1="http://schemas.microsoft.com/office/drawing/2015/9/8/chartex" xmlns:mc="http://schemas.openxmlformats.org/markup-compatibility/2006" xmlns:o="urn:schemas-microsoft-com:office:office" xmlns:r="http://schemas.openxmlformats.org/officeDocument/2006/relationships" xmlns:m="http://schemas.openxmlformats.org/officeDocument/2006/math" xmlns:v="urn:schemas-microsoft-com:vml" xmlns:wp14="http://schemas.microsoft.com/office/word/2010/wordprocessingDrawing" xmlns:wp="http://schemas.openxmlformats.org/drawingml/2006/wordprocessingDrawing" xmlns:w10="urn:schemas-microsoft-com:office:word" xmlns:w="http://schemas.openxmlformats.org/wordprocessingml/2006/main" xmlns:w14="http://schemas.microsoft.com/office/word/2010/wordml" xmlns:w15="http://schemas.microsoft.com/office/word/2012/wordml" xmlns:w16se="http://schemas.microsoft.com/office/word/2015/wordml/symex" xmlns:wpg="http://schemas.microsoft.com/office/word/2010/wordprocessingGroup" xmlns:wpi="http://schemas.microsoft.com/office/word/2010/wordprocessingInk" xmlns:wne="http://schemas.microsoft.com/office/word/2006/wordml" xmlns:wps="http://schemas.microsoft.com/office/word/2010/wordprocessingShape" mc:Ignorable="w14 w15 w16se wp14">
   <w:body>
+    <w:p>
+      <w:pPr>
+        <w:tabs>
+          <w:tab w:val="left" w:pos="4253"/>
+        </w:tabs>
+        <w:spacing w:after="0"/>
+        <w:jc w:val="center"/>
+        <w:rPr>
+          <w:rFonts w:ascii="Times New Roman" w:eastAsia="Times New Roman" w:hAnsi="Times New Roman" w:cs="Times New Roman"/>
+          <w:color w:val="000000" w:themeColor="text1"/>
+          <w:sz w:val="28"/>
+          <w:szCs w:val="28"/>
+        </w:rPr>
+      </w:pPr>
+      <w:r>
+        <w:rPr>
+          <w:rFonts w:ascii="Times New Roman" w:hAnsi="Times New Roman" w:cs="Times New Roman"/>
+          <w:b/>
+          <w:sz w:val="32"/>
+          <w:shd w:val="clear" w:color="auto" w:fill="FFFFFF"/>
+        </w:rPr>
+        <w:br w:type="page"/>
+      </w:r>
+      <w:r>
+        <w:rPr>
+          <w:rFonts w:ascii="Times New Roman" w:eastAsia="Times New Roman" w:hAnsi="Times New Roman" w:cs="Times New Roman"/>
+          <w:color w:val="000000" w:themeColor="text1"/>
+          <w:sz w:val="28"/>
+          <w:szCs w:val="28"/>
+        </w:rPr>
+        <w:lastRenderedPageBreak/>
+        <w:t xml:space="preserve">Министерство образования Республики Беларусь </w:t>
+      </w:r>
+    </w:p>
+    <w:p>
+      <w:pPr>
+        <w:tabs>
+          <w:tab w:val="left" w:pos="4253"/>
+        </w:tabs>
+        <w:spacing w:after="0"/>
+        <w:jc w:val="center"/>
+        <w:rPr>
+          <w:rFonts w:ascii="Times New Roman" w:hAnsi="Times New Roman" w:cs="Times New Roman"/>
+          <w:sz w:val="28"/>
+          <w:szCs w:val="28"/>
+        </w:rPr>
+      </w:pPr>
+      <w:r>
+        <w:rPr>
+          <w:rFonts w:ascii="Times New Roman" w:eastAsia="Times New Roman" w:hAnsi="Times New Roman" w:cs="Times New Roman"/>
+          <w:color w:val="000000" w:themeColor="text1"/>
+          <w:sz w:val="28"/>
+          <w:szCs w:val="28"/>
+        </w:rPr>
+        <w:t>Учреждение образования</w:t>
+      </w:r>
+    </w:p>
+    <w:p>
+      <w:pPr>
+        <w:tabs>
+          <w:tab w:val="left" w:pos="4253"/>
+        </w:tabs>
+        <w:spacing w:after="0"/>
+        <w:jc w:val="center"/>
+        <w:rPr>
+          <w:rFonts w:ascii="Times New Roman" w:hAnsi="Times New Roman" w:cs="Times New Roman"/>
+          <w:sz w:val="28"/>
+          <w:szCs w:val="28"/>
+        </w:rPr>
+      </w:pPr>
+      <w:r>
+        <w:rPr>
+          <w:rFonts w:ascii="Times New Roman" w:eastAsia="Times New Roman" w:hAnsi="Times New Roman" w:cs="Times New Roman"/>
+          <w:color w:val="000000" w:themeColor="text1"/>
+          <w:sz w:val="28"/>
+          <w:szCs w:val="28"/>
+        </w:rPr>
+        <w:t>«Белорусский государственный университет</w:t>
+      </w:r>
+    </w:p>
+    <w:p>
+      <w:pPr>
+        <w:tabs>
+          <w:tab w:val="left" w:pos="4253"/>
+        </w:tabs>
+        <w:spacing w:after="0"/>
+        <w:jc w:val="center"/>
+        <w:rPr>
+          <w:rFonts w:ascii="Times New Roman" w:hAnsi="Times New Roman" w:cs="Times New Roman"/>
+          <w:sz w:val="28"/>
+          <w:szCs w:val="28"/>
+        </w:rPr>
+      </w:pPr>
+      <w:r>
+        <w:rPr>
+          <w:rFonts w:ascii="Times New Roman" w:eastAsia="Times New Roman" w:hAnsi="Times New Roman" w:cs="Times New Roman"/>
+          <w:color w:val="000000" w:themeColor="text1"/>
+          <w:sz w:val="28"/>
+          <w:szCs w:val="28"/>
+        </w:rPr>
+        <w:t>информатики и радиоэлектроники»</w:t>
+      </w:r>
+    </w:p>
+    <w:p>
+      <w:pPr>
+        <w:tabs>
+          <w:tab w:val="left" w:pos="4253"/>
+        </w:tabs>
+        <w:spacing w:after="0"/>
+        <w:rPr>
+          <w:rFonts w:ascii="Times New Roman" w:hAnsi="Times New Roman" w:cs="Times New Roman"/>
+          <w:sz w:val="28"/>
+          <w:szCs w:val="28"/>
+        </w:rPr>
+      </w:pPr>
+    </w:p>
+    <w:p>
+      <w:pPr>
+        <w:tabs>
+          <w:tab w:val="left" w:pos="4253"/>
+        </w:tabs>
+        <w:spacing w:after="0"/>
+        <w:jc w:val="center"/>
+        <w:rPr>
+          <w:rFonts w:ascii="Times New Roman" w:hAnsi="Times New Roman" w:cs="Times New Roman"/>
+          <w:sz w:val="28"/>
+          <w:szCs w:val="28"/>
+        </w:rPr>
+      </w:pPr>
+      <w:r>
+        <w:rPr>
+          <w:rFonts w:ascii="Times New Roman" w:hAnsi="Times New Roman" w:cs="Times New Roman"/>
+          <w:sz w:val="28"/>
+          <w:szCs w:val="28"/>
+        </w:rPr>
+        <w:t>Кафедра инженерной психологии и эргономики</w:t>
+      </w:r>
+    </w:p>
+    <w:p>
+      <w:pPr>
+        <w:tabs>
+          <w:tab w:val="left" w:pos="4253"/>
+        </w:tabs>
+        <w:spacing w:after="0"/>
+        <w:jc w:val="center"/>
+        <w:rPr>
+          <w:rFonts w:ascii="Times New Roman" w:hAnsi="Times New Roman" w:cs="Times New Roman"/>
+          <w:sz w:val="28"/>
+          <w:szCs w:val="28"/>
+        </w:rPr>
+      </w:pPr>
+    </w:p>
+    <w:p>
+      <w:pPr>
+        <w:tabs>
+          <w:tab w:val="left" w:pos="4253"/>
+        </w:tabs>
+        <w:spacing w:after="0"/>
+        <w:jc w:val="center"/>
+        <w:rPr>
+          <w:rFonts w:ascii="Times New Roman" w:hAnsi="Times New Roman" w:cs="Times New Roman"/>
+          <w:sz w:val="28"/>
+          <w:szCs w:val="28"/>
+        </w:rPr>
+      </w:pPr>
+      <w:r>
+        <w:rPr>
+          <w:rFonts w:ascii="Times New Roman" w:hAnsi="Times New Roman" w:cs="Times New Roman"/>
+          <w:sz w:val="28"/>
+          <w:szCs w:val="28"/>
+        </w:rPr>
+        <w:t xml:space="preserve">Дисциплина: </w:t>
+      </w:r>
+      <w:r>
+        <w:rPr>
+          <w:rFonts w:ascii="Times New Roman" w:hAnsi="Times New Roman" w:cs="Times New Roman"/>
+          <w:sz w:val="28"/>
+          <w:szCs w:val="28"/>
+        </w:rPr>
+        <w:t>Пользовательские интерфейсы информационных систем</w:t>
+      </w:r>
+    </w:p>
+    <w:p>
+      <w:pPr>
+        <w:tabs>
+          <w:tab w:val="left" w:pos="4253"/>
+        </w:tabs>
+        <w:spacing w:after="0"/>
+        <w:rPr>
+          <w:rFonts w:ascii="Times New Roman" w:hAnsi="Times New Roman" w:cs="Times New Roman"/>
+          <w:sz w:val="28"/>
+          <w:szCs w:val="28"/>
+        </w:rPr>
+      </w:pPr>
+    </w:p>
+    <w:p>
+      <w:pPr>
+        <w:tabs>
+          <w:tab w:val="left" w:pos="4253"/>
+        </w:tabs>
+        <w:spacing w:after="0"/>
+        <w:rPr>
+          <w:rFonts w:ascii="Times New Roman" w:hAnsi="Times New Roman" w:cs="Times New Roman"/>
+          <w:sz w:val="28"/>
+          <w:szCs w:val="28"/>
+        </w:rPr>
+      </w:pPr>
+    </w:p>
+    <w:p>
+      <w:pPr>
+        <w:tabs>
+          <w:tab w:val="left" w:pos="4253"/>
+        </w:tabs>
+        <w:spacing w:after="0"/>
+        <w:rPr>
+          <w:rFonts w:ascii="Times New Roman" w:hAnsi="Times New Roman" w:cs="Times New Roman"/>
+          <w:sz w:val="28"/>
+          <w:szCs w:val="28"/>
+        </w:rPr>
+      </w:pPr>
+    </w:p>
+    <w:p>
+      <w:pPr>
+        <w:tabs>
+          <w:tab w:val="left" w:pos="4253"/>
+        </w:tabs>
+        <w:spacing w:after="0"/>
+        <w:rPr>
+          <w:rFonts w:ascii="Times New Roman" w:eastAsia="Times New Roman" w:hAnsi="Times New Roman" w:cs="Times New Roman"/>
+          <w:sz w:val="28"/>
+          <w:szCs w:val="28"/>
+        </w:rPr>
+      </w:pPr>
+    </w:p>
+    <w:p>
+      <w:pPr>
+        <w:tabs>
+          <w:tab w:val="left" w:pos="4253"/>
+        </w:tabs>
+        <w:spacing w:after="0"/>
+        <w:rPr>
+          <w:rFonts w:ascii="Times New Roman" w:eastAsia="Times New Roman" w:hAnsi="Times New Roman" w:cs="Times New Roman"/>
+          <w:sz w:val="28"/>
+          <w:szCs w:val="28"/>
+        </w:rPr>
+      </w:pPr>
+    </w:p>
+    <w:p>
+      <w:pPr>
+        <w:tabs>
+          <w:tab w:val="left" w:pos="4253"/>
+        </w:tabs>
+        <w:spacing w:after="0"/>
+        <w:rPr>
+          <w:rFonts w:ascii="Times New Roman" w:eastAsia="Times New Roman" w:hAnsi="Times New Roman" w:cs="Times New Roman"/>
+          <w:sz w:val="28"/>
+          <w:szCs w:val="28"/>
+        </w:rPr>
+      </w:pPr>
+    </w:p>
+    <w:p>
+      <w:pPr>
+        <w:tabs>
+          <w:tab w:val="left" w:pos="4253"/>
+        </w:tabs>
+        <w:spacing w:after="0"/>
+        <w:rPr>
+          <w:rFonts w:ascii="Times New Roman" w:eastAsia="Times New Roman" w:hAnsi="Times New Roman" w:cs="Times New Roman"/>
+          <w:sz w:val="28"/>
+          <w:szCs w:val="28"/>
+        </w:rPr>
+      </w:pPr>
+    </w:p>
+    <w:p>
+      <w:pPr>
+        <w:tabs>
+          <w:tab w:val="left" w:pos="4253"/>
+        </w:tabs>
+        <w:spacing w:after="0"/>
+        <w:rPr>
+          <w:rFonts w:ascii="Times New Roman" w:eastAsia="Times New Roman" w:hAnsi="Times New Roman" w:cs="Times New Roman"/>
+          <w:bCs/>
+          <w:sz w:val="28"/>
+          <w:szCs w:val="28"/>
+        </w:rPr>
+      </w:pPr>
+    </w:p>
+    <w:p>
+      <w:pPr>
+        <w:tabs>
+          <w:tab w:val="left" w:pos="4253"/>
+        </w:tabs>
+        <w:spacing w:after="0"/>
+        <w:jc w:val="center"/>
+        <w:rPr>
+          <w:rFonts w:ascii="Times New Roman" w:eastAsia="Times New Roman" w:hAnsi="Times New Roman" w:cs="Times New Roman"/>
+          <w:bCs/>
+          <w:color w:val="000000" w:themeColor="text1"/>
+          <w:sz w:val="28"/>
+          <w:szCs w:val="28"/>
+        </w:rPr>
+      </w:pPr>
+      <w:r>
+        <w:rPr>
+          <w:rFonts w:ascii="Times New Roman" w:eastAsia="Times New Roman" w:hAnsi="Times New Roman" w:cs="Times New Roman"/>
+          <w:bCs/>
+          <w:color w:val="000000" w:themeColor="text1"/>
+          <w:sz w:val="28"/>
+          <w:szCs w:val="28"/>
+        </w:rPr>
+        <w:t>Отчет</w:t>
+      </w:r>
+    </w:p>
+    <w:p>
+      <w:pPr>
+        <w:tabs>
+          <w:tab w:val="left" w:pos="4253"/>
+        </w:tabs>
+        <w:spacing w:after="0"/>
+        <w:jc w:val="center"/>
+        <w:rPr>
+          <w:rFonts w:ascii="Times New Roman" w:eastAsia="Times New Roman" w:hAnsi="Times New Roman" w:cs="Times New Roman"/>
+          <w:bCs/>
+          <w:color w:val="000000" w:themeColor="text1"/>
+          <w:sz w:val="28"/>
+          <w:szCs w:val="28"/>
+        </w:rPr>
+      </w:pPr>
+      <w:r>
+        <w:rPr>
+          <w:rFonts w:ascii="Times New Roman" w:eastAsia="Times New Roman" w:hAnsi="Times New Roman" w:cs="Times New Roman"/>
+          <w:bCs/>
+          <w:color w:val="000000" w:themeColor="text1"/>
+          <w:sz w:val="28"/>
+          <w:szCs w:val="28"/>
+        </w:rPr>
+        <w:t>по практическому занятию</w:t>
+      </w:r>
+    </w:p>
+    <w:p>
+      <w:pPr>
+        <w:tabs>
+          <w:tab w:val="left" w:pos="4253"/>
+        </w:tabs>
+        <w:spacing w:after="0"/>
+        <w:jc w:val="center"/>
+        <w:rPr>
+          <w:rFonts w:ascii="Times New Roman" w:eastAsia="Times New Roman" w:hAnsi="Times New Roman" w:cs="Times New Roman"/>
+          <w:bCs/>
+          <w:color w:val="000000" w:themeColor="text1"/>
+          <w:sz w:val="28"/>
+          <w:szCs w:val="28"/>
+        </w:rPr>
+      </w:pPr>
+      <w:r>
+        <w:rPr>
+          <w:rFonts w:ascii="Times New Roman" w:eastAsia="Times New Roman" w:hAnsi="Times New Roman" w:cs="Times New Roman"/>
+          <w:bCs/>
+          <w:color w:val="000000" w:themeColor="text1"/>
+          <w:sz w:val="28"/>
+          <w:szCs w:val="28"/>
+        </w:rPr>
+        <w:t>на тему:</w:t>
+      </w:r>
+    </w:p>
+    <w:p>
+      <w:pPr>
+        <w:tabs>
+          <w:tab w:val="left" w:pos="4253"/>
+        </w:tabs>
+        <w:spacing w:after="0" w:line="228" w:lineRule="auto"/>
+        <w:jc w:val="center"/>
+        <w:rPr>
+          <w:rFonts w:ascii="Times New Roman" w:eastAsia="Times New Roman" w:hAnsi="Times New Roman" w:cs="Times New Roman"/>
+          <w:bCs/>
+          <w:color w:val="000000" w:themeColor="text1"/>
+          <w:sz w:val="28"/>
+          <w:szCs w:val="28"/>
+        </w:rPr>
+      </w:pPr>
+      <w:r>
+        <w:rPr>
+          <w:rFonts w:ascii="Times New Roman" w:eastAsia="Times New Roman" w:hAnsi="Times New Roman" w:cs="Times New Roman"/>
+          <w:bCs/>
+          <w:color w:val="000000" w:themeColor="text1"/>
+          <w:sz w:val="28"/>
+          <w:szCs w:val="28"/>
+        </w:rPr>
+        <w:t>«</w:t>
+      </w:r>
+      <w:proofErr w:type="spellStart"/>
+      <w:r>
+        <w:rPr>
+          <w:rFonts w:ascii="Times New Roman" w:eastAsia="Times New Roman" w:hAnsi="Times New Roman" w:cs="Times New Roman"/>
+          <w:bCs/>
+          <w:color w:val="000000" w:themeColor="text1"/>
+          <w:sz w:val="28"/>
+          <w:szCs w:val="28"/>
+          <w:lang w:val="en-US"/>
+        </w:rPr>
+        <w:t>Git</w:t>
+      </w:r>
+      <w:proofErr w:type="spellEnd"/>
+      <w:r>
+        <w:rPr>
+          <w:rFonts w:ascii="Times New Roman" w:eastAsia="Times New Roman" w:hAnsi="Times New Roman" w:cs="Times New Roman"/>
+          <w:bCs/>
+          <w:color w:val="000000" w:themeColor="text1"/>
+          <w:sz w:val="28"/>
+          <w:szCs w:val="28"/>
+        </w:rPr>
+        <w:t>»</w:t>
+      </w:r>
+    </w:p>
+    <w:p>
+      <w:pPr>
+        <w:tabs>
+          <w:tab w:val="left" w:pos="4253"/>
+        </w:tabs>
+        <w:spacing w:after="0"/>
+        <w:rPr>
+          <w:rFonts w:ascii="Times New Roman" w:eastAsia="Times New Roman" w:hAnsi="Times New Roman" w:cs="Times New Roman"/>
+          <w:sz w:val="28"/>
+          <w:szCs w:val="28"/>
+        </w:rPr>
+      </w:pPr>
+    </w:p>
+    <w:p>
+      <w:pPr>
+        <w:tabs>
+          <w:tab w:val="left" w:pos="4253"/>
+        </w:tabs>
+        <w:spacing w:after="0"/>
+        <w:rPr>
+          <w:rFonts w:ascii="Times New Roman" w:eastAsia="Times New Roman" w:hAnsi="Times New Roman" w:cs="Times New Roman"/>
+          <w:sz w:val="28"/>
+          <w:szCs w:val="28"/>
+        </w:rPr>
+      </w:pPr>
+      <w:bookmarkStart w:id="0" w:name="_GoBack"/>
+      <w:bookmarkEnd w:id="0"/>
+    </w:p>
+    <w:p>
+      <w:pPr>
+        <w:tabs>
+          <w:tab w:val="left" w:pos="4253"/>
+        </w:tabs>
+        <w:spacing w:after="0"/>
+        <w:rPr>
+          <w:rFonts w:ascii="Times New Roman" w:eastAsia="Times New Roman" w:hAnsi="Times New Roman" w:cs="Times New Roman"/>
+          <w:sz w:val="28"/>
+          <w:szCs w:val="28"/>
+        </w:rPr>
+      </w:pPr>
+    </w:p>
+    <w:p>
+      <w:pPr>
+        <w:tabs>
+          <w:tab w:val="left" w:pos="4253"/>
+        </w:tabs>
+        <w:spacing w:after="0"/>
+        <w:rPr>
+          <w:rFonts w:ascii="Times New Roman" w:eastAsia="Times New Roman" w:hAnsi="Times New Roman" w:cs="Times New Roman"/>
+          <w:sz w:val="28"/>
+          <w:szCs w:val="28"/>
+        </w:rPr>
+      </w:pPr>
+    </w:p>
+    <w:p>
+      <w:pPr>
+        <w:tabs>
+          <w:tab w:val="left" w:pos="4253"/>
+        </w:tabs>
+        <w:spacing w:after="0"/>
+        <w:rPr>
+          <w:rFonts w:ascii="Times New Roman" w:eastAsia="Times New Roman" w:hAnsi="Times New Roman" w:cs="Times New Roman"/>
+          <w:sz w:val="28"/>
+          <w:szCs w:val="28"/>
+        </w:rPr>
+      </w:pPr>
+    </w:p>
+    <w:p>
+      <w:pPr>
+        <w:tabs>
+          <w:tab w:val="left" w:pos="4253"/>
+        </w:tabs>
+        <w:spacing w:after="0"/>
+        <w:rPr>
+          <w:rFonts w:ascii="Times New Roman" w:eastAsia="Times New Roman" w:hAnsi="Times New Roman" w:cs="Times New Roman"/>
+          <w:sz w:val="28"/>
+          <w:szCs w:val="28"/>
+        </w:rPr>
+      </w:pPr>
+    </w:p>
+    <w:p>
+      <w:pPr>
+        <w:tabs>
+          <w:tab w:val="left" w:pos="4253"/>
+        </w:tabs>
+        <w:spacing w:after="0"/>
+        <w:rPr>
+          <w:rFonts w:ascii="Times New Roman" w:eastAsia="Times New Roman" w:hAnsi="Times New Roman" w:cs="Times New Roman"/>
+          <w:color w:val="000000" w:themeColor="text1"/>
+          <w:sz w:val="28"/>
+          <w:szCs w:val="28"/>
+        </w:rPr>
+      </w:pPr>
+      <w:r>
+        <w:rPr>
+          <w:rFonts w:ascii="Times New Roman" w:eastAsia="Times New Roman" w:hAnsi="Times New Roman" w:cs="Times New Roman"/>
+          <w:color w:val="000000" w:themeColor="text1"/>
+          <w:sz w:val="28"/>
+          <w:szCs w:val="28"/>
+        </w:rPr>
+        <w:t xml:space="preserve">                                                                                            </w:t>
+      </w:r>
+    </w:p>
+    <w:p>
+      <w:pPr>
+        <w:tabs>
+          <w:tab w:val="left" w:pos="4253"/>
+        </w:tabs>
+        <w:spacing w:after="0"/>
+        <w:rPr>
+          <w:rFonts w:ascii="Times New Roman" w:eastAsia="Times New Roman" w:hAnsi="Times New Roman" w:cs="Times New Roman"/>
+          <w:color w:val="000000" w:themeColor="text1"/>
+          <w:sz w:val="28"/>
+          <w:szCs w:val="28"/>
+        </w:rPr>
+      </w:pPr>
+    </w:p>
+    <w:p>
+      <w:pPr>
+        <w:tabs>
+          <w:tab w:val="left" w:pos="4253"/>
+        </w:tabs>
+        <w:spacing w:after="0"/>
+        <w:rPr>
+          <w:rFonts w:ascii="Times New Roman" w:eastAsia="Times New Roman" w:hAnsi="Times New Roman" w:cs="Times New Roman"/>
+          <w:color w:val="000000" w:themeColor="text1"/>
+          <w:sz w:val="28"/>
+          <w:szCs w:val="28"/>
+        </w:rPr>
+      </w:pPr>
+    </w:p>
+    <w:p>
+      <w:pPr>
+        <w:tabs>
+          <w:tab w:val="left" w:pos="4253"/>
+        </w:tabs>
+        <w:spacing w:after="0"/>
+        <w:rPr>
+          <w:rFonts w:ascii="Times New Roman" w:eastAsia="Times New Roman" w:hAnsi="Times New Roman" w:cs="Times New Roman"/>
+          <w:color w:val="000000" w:themeColor="text1"/>
+          <w:sz w:val="28"/>
+          <w:szCs w:val="28"/>
+        </w:rPr>
+      </w:pPr>
+    </w:p>
+    <w:p>
+      <w:pPr>
+        <w:tabs>
+          <w:tab w:val="left" w:pos="4253"/>
+        </w:tabs>
+        <w:spacing w:after="0"/>
+        <w:rPr>
+          <w:rFonts w:ascii="Times New Roman" w:eastAsia="Times New Roman" w:hAnsi="Times New Roman" w:cs="Times New Roman"/>
+          <w:color w:val="000000" w:themeColor="text1"/>
+          <w:sz w:val="28"/>
+          <w:szCs w:val="28"/>
+        </w:rPr>
+      </w:pPr>
+    </w:p>
+    <w:p>
+      <w:pPr>
+        <w:tabs>
+          <w:tab w:val="left" w:pos="4253"/>
+        </w:tabs>
+        <w:spacing w:after="0"/>
+        <w:rPr>
+          <w:rFonts w:ascii="Times New Roman" w:eastAsia="Times New Roman" w:hAnsi="Times New Roman" w:cs="Times New Roman"/>
+          <w:color w:val="000000" w:themeColor="text1"/>
+          <w:sz w:val="28"/>
+          <w:szCs w:val="28"/>
+        </w:rPr>
+      </w:pPr>
+    </w:p>
+    <w:p>
+      <w:pPr>
+        <w:tabs>
+          <w:tab w:val="left" w:pos="4253"/>
+        </w:tabs>
+        <w:spacing w:after="0"/>
+        <w:rPr>
+          <w:rFonts w:ascii="Times New Roman" w:eastAsia="Times New Roman" w:hAnsi="Times New Roman" w:cs="Times New Roman"/>
+          <w:color w:val="000000" w:themeColor="text1"/>
+          <w:sz w:val="28"/>
+          <w:szCs w:val="28"/>
+        </w:rPr>
+      </w:pPr>
+      <w:proofErr w:type="gramStart"/>
+      <w:r>
+        <w:rPr>
+          <w:rFonts w:ascii="Times New Roman" w:eastAsia="Times New Roman" w:hAnsi="Times New Roman" w:cs="Times New Roman"/>
+          <w:color w:val="000000" w:themeColor="text1"/>
+          <w:sz w:val="28"/>
+          <w:szCs w:val="28"/>
+        </w:rPr>
+        <w:t>Проверил</w:t>
+      </w:r>
+      <w:r>
+        <w:rPr>
+          <w:rFonts w:ascii="Times New Roman" w:eastAsia="Times New Roman" w:hAnsi="Times New Roman" w:cs="Times New Roman"/>
+          <w:color w:val="000000" w:themeColor="text1"/>
+          <w:sz w:val="28"/>
+          <w:szCs w:val="28"/>
+        </w:rPr>
+        <w:t xml:space="preserve">:   </w:t>
+      </w:r>
+      <w:proofErr w:type="gramEnd"/>
+      <w:r>
+        <w:rPr>
+          <w:rFonts w:ascii="Times New Roman" w:eastAsia="Times New Roman" w:hAnsi="Times New Roman" w:cs="Times New Roman"/>
+          <w:color w:val="000000" w:themeColor="text1"/>
+          <w:sz w:val="28"/>
+          <w:szCs w:val="28"/>
+        </w:rPr>
+        <w:t xml:space="preserve">                                                                               </w:t>
+      </w:r>
+      <w:r>
+        <w:rPr>
+          <w:rFonts w:ascii="Times New Roman" w:eastAsia="Times New Roman" w:hAnsi="Times New Roman" w:cs="Times New Roman"/>
+          <w:color w:val="000000" w:themeColor="text1"/>
+          <w:sz w:val="28"/>
+          <w:szCs w:val="28"/>
+          <w:lang w:val="en-US"/>
+        </w:rPr>
+        <w:t xml:space="preserve"> </w:t>
+      </w:r>
+      <w:r>
+        <w:rPr>
+          <w:rFonts w:ascii="Times New Roman" w:eastAsia="Times New Roman" w:hAnsi="Times New Roman" w:cs="Times New Roman"/>
+          <w:color w:val="000000" w:themeColor="text1"/>
+          <w:sz w:val="28"/>
+          <w:szCs w:val="28"/>
+        </w:rPr>
+        <w:t xml:space="preserve">       </w:t>
+      </w:r>
+      <w:r>
+        <w:rPr>
+          <w:rFonts w:ascii="Times New Roman" w:eastAsia="Times New Roman" w:hAnsi="Times New Roman" w:cs="Times New Roman"/>
+          <w:color w:val="000000" w:themeColor="text1"/>
+          <w:sz w:val="28"/>
+          <w:szCs w:val="28"/>
+        </w:rPr>
+        <w:t xml:space="preserve">      </w:t>
+      </w:r>
+      <w:r>
+        <w:rPr>
+          <w:rFonts w:ascii="Times New Roman" w:eastAsia="Times New Roman" w:hAnsi="Times New Roman" w:cs="Times New Roman"/>
+          <w:color w:val="000000" w:themeColor="text1"/>
+          <w:sz w:val="28"/>
+          <w:szCs w:val="28"/>
+        </w:rPr>
+        <w:t xml:space="preserve">Выполнил: </w:t>
+      </w:r>
+    </w:p>
+    <w:p>
+      <w:pPr>
+        <w:tabs>
+          <w:tab w:val="left" w:pos="4253"/>
+        </w:tabs>
+        <w:spacing w:after="0"/>
+        <w:jc w:val="center"/>
+        <w:rPr>
+          <w:rFonts w:ascii="Times New Roman" w:eastAsia="Times New Roman" w:hAnsi="Times New Roman" w:cs="Times New Roman"/>
+          <w:color w:val="000000" w:themeColor="text1"/>
+          <w:sz w:val="28"/>
+          <w:szCs w:val="28"/>
+        </w:rPr>
+      </w:pPr>
+      <w:r>
+        <w:rPr>
+          <w:rFonts w:ascii="Times New Roman" w:eastAsia="Times New Roman" w:hAnsi="Times New Roman" w:cs="Times New Roman"/>
+          <w:color w:val="000000" w:themeColor="text1"/>
+          <w:sz w:val="28"/>
+          <w:szCs w:val="28"/>
+        </w:rPr>
+        <w:t xml:space="preserve">                                                                                   </w:t>
+      </w:r>
+      <w:r>
+        <w:rPr>
+          <w:rFonts w:ascii="Times New Roman" w:eastAsia="Times New Roman" w:hAnsi="Times New Roman" w:cs="Times New Roman"/>
+          <w:color w:val="000000" w:themeColor="text1"/>
+          <w:sz w:val="28"/>
+          <w:szCs w:val="28"/>
+        </w:rPr>
+        <w:t xml:space="preserve">     </w:t>
+      </w:r>
+      <w:r>
+        <w:rPr>
+          <w:rFonts w:ascii="Times New Roman" w:eastAsia="Times New Roman" w:hAnsi="Times New Roman" w:cs="Times New Roman"/>
+          <w:color w:val="000000" w:themeColor="text1"/>
+          <w:sz w:val="28"/>
+          <w:szCs w:val="28"/>
+        </w:rPr>
+        <w:t xml:space="preserve">    Студент группы 210902</w:t>
+      </w:r>
+    </w:p>
+    <w:p>
+      <w:pPr>
+        <w:spacing w:after="0"/>
+        <w:rPr>
+          <w:rFonts w:ascii="Times New Roman" w:hAnsi="Times New Roman" w:cs="Times New Roman"/>
+          <w:sz w:val="28"/>
+        </w:rPr>
+      </w:pPr>
+      <w:r>
+        <w:rPr>
+          <w:rFonts w:ascii="Times New Roman" w:eastAsia="Times New Roman" w:hAnsi="Times New Roman" w:cs="Times New Roman"/>
+          <w:color w:val="000000" w:themeColor="text1"/>
+          <w:sz w:val="28"/>
+          <w:szCs w:val="28"/>
+        </w:rPr>
+        <w:t>Давыдович К.И.</w:t>
+      </w:r>
+      <w:r>
+        <w:rPr>
+          <w:rFonts w:ascii="Times New Roman" w:eastAsia="Times New Roman" w:hAnsi="Times New Roman" w:cs="Times New Roman"/>
+          <w:color w:val="000000" w:themeColor="text1"/>
+          <w:sz w:val="28"/>
+          <w:szCs w:val="28"/>
+        </w:rPr>
+        <w:tab/>
+      </w:r>
+      <w:r>
+        <w:rPr>
+          <w:rFonts w:ascii="Times New Roman" w:eastAsia="Times New Roman" w:hAnsi="Times New Roman" w:cs="Times New Roman"/>
+          <w:color w:val="000000" w:themeColor="text1"/>
+          <w:sz w:val="28"/>
+          <w:szCs w:val="28"/>
+        </w:rPr>
+        <w:t xml:space="preserve">                                             </w:t>
+      </w:r>
+      <w:r>
+        <w:rPr>
+          <w:rFonts w:ascii="Times New Roman" w:eastAsia="Times New Roman" w:hAnsi="Times New Roman" w:cs="Times New Roman"/>
+          <w:color w:val="000000" w:themeColor="text1"/>
+          <w:sz w:val="28"/>
+          <w:szCs w:val="28"/>
+        </w:rPr>
+        <w:t xml:space="preserve">                                 </w:t>
+      </w:r>
+      <w:r>
+        <w:rPr>
+          <w:rFonts w:ascii="Times New Roman" w:eastAsia="Times New Roman" w:hAnsi="Times New Roman" w:cs="Times New Roman"/>
+          <w:color w:val="000000" w:themeColor="text1"/>
+          <w:sz w:val="28"/>
+          <w:szCs w:val="28"/>
+        </w:rPr>
+        <w:t xml:space="preserve">      </w:t>
+      </w:r>
+      <w:r>
+        <w:rPr>
+          <w:rFonts w:ascii="Times New Roman" w:hAnsi="Times New Roman" w:cs="Times New Roman"/>
+          <w:sz w:val="28"/>
+        </w:rPr>
+        <w:t>Бабич А.С.</w:t>
+      </w:r>
+    </w:p>
+    <w:p>
+      <w:pPr>
+        <w:tabs>
+          <w:tab w:val="left" w:pos="180"/>
+          <w:tab w:val="left" w:pos="4253"/>
+          <w:tab w:val="right" w:pos="9355"/>
+        </w:tabs>
+        <w:spacing w:after="0"/>
+        <w:rPr>
+          <w:rFonts w:ascii="Times New Roman" w:eastAsia="Times New Roman" w:hAnsi="Times New Roman" w:cs="Times New Roman"/>
+          <w:color w:val="000000" w:themeColor="text1"/>
+          <w:sz w:val="28"/>
+          <w:szCs w:val="28"/>
+        </w:rPr>
+      </w:pPr>
+    </w:p>
+    <w:p>
+      <w:pPr>
+        <w:tabs>
+          <w:tab w:val="left" w:pos="180"/>
+          <w:tab w:val="left" w:pos="4253"/>
+          <w:tab w:val="right" w:pos="9355"/>
+        </w:tabs>
+        <w:spacing w:after="0"/>
+        <w:rPr>
+          <w:rFonts w:ascii="Times New Roman" w:eastAsia="Times New Roman" w:hAnsi="Times New Roman" w:cs="Times New Roman"/>
+          <w:color w:val="000000" w:themeColor="text1"/>
+          <w:sz w:val="28"/>
+          <w:szCs w:val="28"/>
+        </w:rPr>
+      </w:pPr>
+    </w:p>
+    <w:p>
+      <w:pPr>
+        <w:tabs>
+          <w:tab w:val="left" w:pos="180"/>
+          <w:tab w:val="left" w:pos="4253"/>
+          <w:tab w:val="right" w:pos="9355"/>
+        </w:tabs>
+        <w:spacing w:after="0"/>
+        <w:rPr>
+          <w:rFonts w:ascii="Times New Roman" w:eastAsia="Times New Roman" w:hAnsi="Times New Roman" w:cs="Times New Roman"/>
+          <w:color w:val="000000" w:themeColor="text1"/>
+          <w:sz w:val="28"/>
+          <w:szCs w:val="28"/>
+        </w:rPr>
+      </w:pPr>
+    </w:p>
+    <w:p>
+      <w:pPr>
+        <w:tabs>
+          <w:tab w:val="left" w:pos="180"/>
+          <w:tab w:val="left" w:pos="4253"/>
+          <w:tab w:val="right" w:pos="9355"/>
+        </w:tabs>
+        <w:spacing w:after="0"/>
+        <w:rPr>
+          <w:rFonts w:ascii="Times New Roman" w:eastAsia="Times New Roman" w:hAnsi="Times New Roman" w:cs="Times New Roman"/>
+          <w:color w:val="000000" w:themeColor="text1"/>
+          <w:sz w:val="28"/>
+          <w:szCs w:val="28"/>
+        </w:rPr>
+      </w:pPr>
+    </w:p>
+    <w:p>
+      <w:pPr>
+        <w:tabs>
+          <w:tab w:val="left" w:pos="180"/>
+          <w:tab w:val="left" w:pos="4253"/>
+          <w:tab w:val="right" w:pos="9355"/>
+        </w:tabs>
+        <w:spacing w:after="0"/>
+        <w:rPr>
+          <w:rFonts w:ascii="Times New Roman" w:eastAsia="Times New Roman" w:hAnsi="Times New Roman" w:cs="Times New Roman"/>
+          <w:color w:val="000000" w:themeColor="text1"/>
+          <w:sz w:val="28"/>
+          <w:szCs w:val="28"/>
+        </w:rPr>
+      </w:pPr>
+    </w:p>
+    <w:p>
+      <w:pPr>
+        <w:tabs>
+          <w:tab w:val="left" w:pos="4253"/>
+        </w:tabs>
+        <w:spacing w:after="0"/>
+        <w:jc w:val="center"/>
+        <w:rPr>
+          <w:rFonts w:ascii="Times New Roman" w:eastAsia="Times New Roman" w:hAnsi="Times New Roman" w:cs="Times New Roman"/>
+          <w:color w:val="000000" w:themeColor="text1"/>
+          <w:sz w:val="28"/>
+          <w:szCs w:val="28"/>
+        </w:rPr>
+      </w:pPr>
+      <w:r>
+        <w:rPr>
+          <w:rFonts w:ascii="Times New Roman" w:eastAsia="Times New Roman" w:hAnsi="Times New Roman" w:cs="Times New Roman"/>
+          <w:color w:val="000000" w:themeColor="text1"/>
+          <w:sz w:val="28"/>
+          <w:szCs w:val="28"/>
+        </w:rPr>
+        <w:t>Минск 2024</w:t>
+      </w:r>
+    </w:p>
+    <w:p>
+      <w:pPr>
+        <w:rPr>
+          <w:rFonts w:ascii="Times New Roman" w:hAnsi="Times New Roman" w:cs="Times New Roman"/>
+          <w:b/>
+          <w:sz w:val="32"/>
+          <w:shd w:val="clear" w:color="auto" w:fill="FFFFFF"/>
+        </w:rPr>
+      </w:pPr>
+    </w:p>
     <w:p>
       <w:pPr>
         <w:rPr>
@@ -902,6 +1786,7 @@
               </w:pBdr>
               <w:shd w:val="clear" w:color="auto" w:fill="FFFFFF"/>
               <w:spacing w:before="0" w:beforeAutospacing="0" w:after="0" w:afterAutospacing="0"/>
+              <w:outlineLvl w:val="1"/>
               <w:rPr>
                 <w:b w:val="0"/>
                 <w:sz w:val="24"/>
@@ -1443,6 +2328,7 @@
           <w:sz w:val="54"/>
           <w:szCs w:val="54"/>
         </w:rPr>
+        <w:lastRenderedPageBreak/>
         <w:t>5. Индексация изменений</w:t>
       </w:r>
     </w:p>
@@ -1576,7 +2462,6 @@
                 <w:sz w:val="21"/>
                 <w:szCs w:val="21"/>
               </w:rPr>
-              <w:lastRenderedPageBreak/>
               <w:t>git</w:t>
             </w:r>
             <w:proofErr w:type="spellEnd"/>
@@ -2527,6 +3412,7 @@
               <w:shd w:val="clear" w:color="auto" w:fill="FFFFFF"/>
               <w:spacing w:before="0" w:beforeAutospacing="0" w:after="0" w:afterAutospacing="0"/>
               <w:jc w:val="center"/>
+              <w:outlineLvl w:val="1"/>
             </w:pPr>
             <w:r>
               <w:rPr>
@@ -2635,6 +3521,7 @@
               <w:shd w:val="clear" w:color="auto" w:fill="FFFFFF"/>
               <w:spacing w:before="0" w:beforeAutospacing="0" w:after="0" w:afterAutospacing="0"/>
               <w:jc w:val="center"/>
+              <w:outlineLvl w:val="1"/>
               <w:rPr>
                 <w:sz w:val="28"/>
                 <w:szCs w:val="24"/>
@@ -2786,7 +3673,17 @@
                 <w:szCs w:val="24"/>
                 <w:shd w:val="clear" w:color="auto" w:fill="FFFFFF"/>
               </w:rPr>
-              <w:t xml:space="preserve">. Если бы вы делали </w:t>
+              <w:t xml:space="preserve">. Если бы вы </w:t>
+            </w:r>
+            <w:r>
+              <w:rPr>
+                <w:rFonts w:ascii="Times New Roman" w:hAnsi="Times New Roman" w:cs="Times New Roman"/>
+                <w:sz w:val="24"/>
+                <w:szCs w:val="24"/>
+                <w:shd w:val="clear" w:color="auto" w:fill="FFFFFF"/>
+              </w:rPr>
+              <w:lastRenderedPageBreak/>
+              <w:t xml:space="preserve">делали </w:t>
             </w:r>
             <w:proofErr w:type="spellStart"/>
             <w:r>
@@ -2860,6 +3757,7 @@
                 <w:bdr w:val="single" w:sz="2" w:space="0" w:color="E5E7EB" w:frame="1"/>
                 <w:lang w:val="en-US"/>
               </w:rPr>
+              <w:lastRenderedPageBreak/>
               <w:t>git</w:t>
             </w:r>
             <w:proofErr w:type="spellEnd"/>
@@ -2995,17 +3893,7 @@
                 <w:szCs w:val="24"/>
                 <w:shd w:val="clear" w:color="auto" w:fill="FFFFFF"/>
               </w:rPr>
-              <w:t xml:space="preserve"> показывает, что в </w:t>
-            </w:r>
-            <w:r>
-              <w:rPr>
-                <w:rFonts w:ascii="Times New Roman" w:hAnsi="Times New Roman" w:cs="Times New Roman"/>
-                <w:sz w:val="24"/>
-                <w:szCs w:val="24"/>
-                <w:shd w:val="clear" w:color="auto" w:fill="FFFFFF"/>
-              </w:rPr>
-              <w:lastRenderedPageBreak/>
-              <w:t>файле </w:t>
+              <w:t> показывает, что в файле </w:t>
             </w:r>
             <w:r>
               <w:rPr>
@@ -3056,7 +3944,6 @@
                 <w:rFonts w:ascii="Consolas" w:hAnsi="Consolas"/>
                 <w:bdr w:val="single" w:sz="2" w:space="0" w:color="E5E7EB" w:frame="1"/>
               </w:rPr>
-              <w:lastRenderedPageBreak/>
               <w:t>git</w:t>
             </w:r>
             <w:proofErr w:type="spellEnd"/>
@@ -3276,6 +4163,7 @@
               </w:pBdr>
               <w:shd w:val="clear" w:color="auto" w:fill="FFFFFF"/>
               <w:spacing w:before="0" w:beforeAutospacing="0" w:after="0" w:afterAutospacing="0"/>
+              <w:outlineLvl w:val="1"/>
               <w:rPr>
                 <w:b w:val="0"/>
                 <w:sz w:val="24"/>
@@ -4234,6 +5122,7 @@
               </w:pBdr>
               <w:shd w:val="clear" w:color="auto" w:fill="FFFFFF"/>
               <w:spacing w:before="0" w:beforeAutospacing="0" w:after="0" w:afterAutospacing="0"/>
+              <w:outlineLvl w:val="1"/>
               <w:rPr>
                 <w:b w:val="0"/>
                 <w:sz w:val="24"/>
@@ -4556,7 +5445,17 @@
                 <w:szCs w:val="24"/>
                 <w:shd w:val="clear" w:color="auto" w:fill="FFFFFF"/>
               </w:rPr>
-              <w:t>. Для переключения между ветками можно воспользоваться командой</w:t>
+              <w:t xml:space="preserve">. Для </w:t>
+            </w:r>
+            <w:r>
+              <w:rPr>
+                <w:rFonts w:ascii="Times New Roman" w:hAnsi="Times New Roman" w:cs="Times New Roman"/>
+                <w:sz w:val="24"/>
+                <w:szCs w:val="24"/>
+                <w:shd w:val="clear" w:color="auto" w:fill="FFFFFF"/>
+              </w:rPr>
+              <w:lastRenderedPageBreak/>
+              <w:t>переключения между ветками можно воспользоваться командой</w:t>
             </w:r>
             <w:r>
               <w:rPr>
@@ -4622,7 +5521,6 @@
           <w:sz w:val="54"/>
           <w:szCs w:val="54"/>
         </w:rPr>
-        <w:lastRenderedPageBreak/>
         <w:t>11. Создание тегов версий</w:t>
       </w:r>
     </w:p>
@@ -4729,6 +5627,7 @@
               </w:pBdr>
               <w:shd w:val="clear" w:color="auto" w:fill="FFFFFF"/>
               <w:spacing w:before="0" w:beforeAutospacing="0" w:after="0" w:afterAutospacing="0"/>
+              <w:outlineLvl w:val="1"/>
               <w:rPr>
                 <w:b w:val="0"/>
                 <w:sz w:val="24"/>
@@ -5062,6 +5961,7 @@
               </w:pBdr>
               <w:shd w:val="clear" w:color="auto" w:fill="FFFFFF"/>
               <w:spacing w:before="0" w:beforeAutospacing="0" w:after="0" w:afterAutospacing="0"/>
+              <w:outlineLvl w:val="1"/>
               <w:rPr>
                 <w:b w:val="0"/>
                 <w:sz w:val="24"/>
@@ -5138,6 +6038,7 @@
               </w:pBdr>
               <w:shd w:val="clear" w:color="auto" w:fill="FFFFFF"/>
               <w:spacing w:before="0" w:beforeAutospacing="0" w:after="0" w:afterAutospacing="0"/>
+              <w:outlineLvl w:val="1"/>
               <w:rPr>
                 <w:b w:val="0"/>
                 <w:sz w:val="24"/>
@@ -5661,6 +6562,7 @@
               </w:pBdr>
               <w:shd w:val="clear" w:color="auto" w:fill="FFFFFF"/>
               <w:spacing w:before="0" w:beforeAutospacing="0" w:after="0" w:afterAutospacing="0"/>
+              <w:outlineLvl w:val="1"/>
               <w:rPr>
                 <w:b w:val="0"/>
                 <w:sz w:val="24"/>
@@ -5876,6 +6778,7 @@
               </w:pBdr>
               <w:shd w:val="clear" w:color="auto" w:fill="FFFFFF"/>
               <w:spacing w:before="0" w:beforeAutospacing="0" w:after="0" w:afterAutospacing="0"/>
+              <w:outlineLvl w:val="1"/>
               <w:rPr>
                 <w:b w:val="0"/>
                 <w:sz w:val="24"/>
@@ -6785,6 +7688,7 @@
               </w:pBdr>
               <w:shd w:val="clear" w:color="auto" w:fill="FFFFFF"/>
               <w:spacing w:before="0" w:beforeAutospacing="0" w:after="0" w:afterAutospacing="0"/>
+              <w:outlineLvl w:val="1"/>
               <w:rPr>
                 <w:b w:val="0"/>
                 <w:sz w:val="24"/>
@@ -7875,6 +8779,7 @@
               </w:pBdr>
               <w:shd w:val="clear" w:color="auto" w:fill="FFFFFF"/>
               <w:spacing w:before="0" w:beforeAutospacing="0" w:after="0" w:afterAutospacing="0"/>
+              <w:outlineLvl w:val="1"/>
               <w:rPr>
                 <w:b w:val="0"/>
                 <w:sz w:val="24"/>
@@ -8120,6 +9025,7 @@
               </w:pBdr>
               <w:shd w:val="clear" w:color="auto" w:fill="FFFFFF"/>
               <w:spacing w:before="0" w:beforeAutospacing="0" w:after="0" w:afterAutospacing="0"/>
+              <w:outlineLvl w:val="1"/>
               <w:rPr>
                 <w:b w:val="0"/>
                 <w:sz w:val="24"/>
@@ -8845,6 +9751,7 @@
               </w:pBdr>
               <w:shd w:val="clear" w:color="auto" w:fill="FFFFFF"/>
               <w:spacing w:before="0" w:beforeAutospacing="0" w:after="0" w:afterAutospacing="0"/>
+              <w:outlineLvl w:val="1"/>
               <w:rPr>
                 <w:b w:val="0"/>
                 <w:sz w:val="24"/>
@@ -13154,6 +14061,7 @@
               </w:pBdr>
               <w:shd w:val="clear" w:color="auto" w:fill="FFFFFF"/>
               <w:spacing w:before="0" w:beforeAutospacing="0" w:after="0" w:afterAutospacing="0"/>
+              <w:outlineLvl w:val="1"/>
               <w:rPr>
                 <w:b w:val="0"/>
                 <w:sz w:val="24"/>
@@ -13355,6 +14263,7 @@
               </w:pBdr>
               <w:shd w:val="clear" w:color="auto" w:fill="FFFFFF"/>
               <w:spacing w:before="0" w:beforeAutospacing="0" w:after="0" w:afterAutospacing="0"/>
+              <w:outlineLvl w:val="1"/>
               <w:rPr>
                 <w:b w:val="0"/>
                 <w:sz w:val="24"/>
@@ -14432,6 +15341,7 @@
                 <w:rStyle w:val="code-line"/>
                 <w:rFonts w:ascii="Consolas" w:hAnsi="Consolas"/>
                 <w:bdr w:val="single" w:sz="2" w:space="0" w:color="E5E7EB" w:frame="1"/>
+                <w:lang w:val="en-US"/>
               </w:rPr>
             </w:pPr>
             <w:proofErr w:type="spellStart"/>
@@ -14450,6 +15360,7 @@
                 <w:rStyle w:val="code-line"/>
                 <w:rFonts w:ascii="Consolas" w:hAnsi="Consolas"/>
                 <w:bdr w:val="single" w:sz="2" w:space="0" w:color="E5E7EB" w:frame="1"/>
+                <w:lang w:val="en-US"/>
               </w:rPr>
               <w:t xml:space="preserve"> </w:t>
             </w:r>
@@ -14467,6 +15378,7 @@
                 <w:rStyle w:val="code-line"/>
                 <w:rFonts w:ascii="Consolas" w:hAnsi="Consolas"/>
                 <w:bdr w:val="single" w:sz="2" w:space="0" w:color="E5E7EB" w:frame="1"/>
+                <w:lang w:val="en-US"/>
               </w:rPr>
               <w:t xml:space="preserve"> </w:t>
             </w:r>
@@ -14491,6 +15403,7 @@
               </w:pBdr>
               <w:rPr>
                 <w:rFonts w:ascii="Consolas" w:hAnsi="Consolas"/>
+                <w:lang w:val="en-US"/>
               </w:rPr>
             </w:pPr>
             <w:proofErr w:type="spellStart"/>
@@ -14509,6 +15422,7 @@
                 <w:rStyle w:val="code-line"/>
                 <w:rFonts w:ascii="Consolas" w:hAnsi="Consolas"/>
                 <w:bdr w:val="single" w:sz="2" w:space="0" w:color="E5E7EB" w:frame="1"/>
+                <w:lang w:val="en-US"/>
               </w:rPr>
               <w:t xml:space="preserve"> </w:t>
             </w:r>
@@ -14526,6 +15440,7 @@
                 <w:rStyle w:val="code-line"/>
                 <w:rFonts w:ascii="Consolas" w:hAnsi="Consolas"/>
                 <w:bdr w:val="single" w:sz="2" w:space="0" w:color="E5E7EB" w:frame="1"/>
+                <w:lang w:val="en-US"/>
               </w:rPr>
               <w:t xml:space="preserve"> </w:t>
             </w:r>
@@ -14555,6 +15470,7 @@
               </w:pBdr>
               <w:shd w:val="clear" w:color="auto" w:fill="FFFFFF"/>
               <w:spacing w:before="0" w:beforeAutospacing="0" w:after="0" w:afterAutospacing="0"/>
+              <w:outlineLvl w:val="1"/>
               <w:rPr>
                 <w:b w:val="0"/>
                 <w:sz w:val="24"/>
@@ -14710,6 +15626,7 @@
               </w:pBdr>
               <w:shd w:val="clear" w:color="auto" w:fill="FFFFFF"/>
               <w:spacing w:before="0" w:beforeAutospacing="0" w:after="0" w:afterAutospacing="0"/>
+              <w:outlineLvl w:val="1"/>
               <w:rPr>
                 <w:b w:val="0"/>
                 <w:sz w:val="24"/>
@@ -17129,6 +18046,7 @@
               </w:pBdr>
               <w:shd w:val="clear" w:color="auto" w:fill="FFFFFF"/>
               <w:spacing w:before="0" w:beforeAutospacing="0" w:after="0" w:afterAutospacing="0"/>
+              <w:outlineLvl w:val="1"/>
               <w:rPr>
                 <w:b w:val="0"/>
                 <w:sz w:val="24"/>
@@ -19360,10 +20278,7 @@
         </w:tc>
       </w:tr>
     </w:tbl>
-    <w:p>
-      <w:bookmarkStart w:id="0" w:name="_GoBack"/>
-      <w:bookmarkEnd w:id="0"/>
-    </w:p>
+    <w:p/>
     <w:sectPr>
       <w:pgSz w:w="11906" w:h="16838"/>
       <w:pgMar w:top="1134" w:right="850" w:bottom="1134" w:left="1701" w:header="708" w:footer="708" w:gutter="0"/>
@@ -20761,7 +21676,7 @@
 </file>
 
 <file path=customXml/itemProps1.xml><?xml version="1.0" encoding="utf-8"?>
-<ds:datastoreItem xmlns:ds="http://schemas.openxmlformats.org/officeDocument/2006/customXml" ds:itemID="{2D5F1CB0-9912-40F1-8DC3-F1A784EB6D19}">
+<ds:datastoreItem xmlns:ds="http://schemas.openxmlformats.org/officeDocument/2006/customXml" ds:itemID="{15D73382-5702-47C0-AAA1-4E801FD2721A}">
   <ds:schemaRefs>
     <ds:schemaRef ds:uri="http://schemas.openxmlformats.org/officeDocument/2006/bibliography"/>
   </ds:schemaRefs>

</xml_diff>